<commit_message>
Refactor reconciliation and improve CLP matching
Extract shared persistence, Excel styling, and view helpers for USD and CLP workflows. Improve CLP voucher matching, installment and bank-deposit handling, and suggestion lookups; refine upload alignment and reconciliation reports. Update project evidence documents.
</commit_message>
<xml_diff>
--- a/Fase 1/Evidencias Grupales/1.5_GuiaEstudiante_Fase 1_Definicion Proyecto APT.docx
+++ b/Fase 1/Evidencias Grupales/1.5_GuiaEstudiante_Fase 1_Definicion Proyecto APT.docx
@@ -10,7 +10,6 @@
         <w:rPr>
           <w:rtl w:val="0"/>
         </w:rPr>
-        <w:t xml:space="preserve">}</w:t>
       </w:r>
       <w:r>
         <mc:AlternateContent>
@@ -19,7 +18,7 @@
               <wp:anchor allowOverlap="1" behindDoc="0" distB="0" distT="0" distL="114300" distR="114300" hidden="0" layoutInCell="1" locked="0" relativeHeight="0" simplePos="0">
                 <wp:simplePos x="0" y="0"/>
                 <wp:positionH relativeFrom="column">
-                  <wp:posOffset>-435397</wp:posOffset>
+                  <wp:posOffset>-435396</wp:posOffset>
                 </wp:positionH>
                 <wp:positionV relativeFrom="paragraph">
                   <wp:posOffset>33444</wp:posOffset>
@@ -27,7 +26,7 @@
                 <wp:extent cx="6580505" cy="1486535"/>
                 <wp:effectExtent b="0" l="0" r="0" t="0"/>
                 <wp:wrapNone/>
-                <wp:docPr id="50" name=""/>
+                <wp:docPr id="52" name=""/>
                 <a:graphic>
                   <a:graphicData uri="http://schemas.microsoft.com/office/word/2010/wordprocessingGroup">
                     <wpg:wgp>
@@ -88,8 +87,8 @@
                             <a:xfrm>
                               <a:off x="2055748" y="3036733"/>
                               <a:ext cx="6580505" cy="1486535"/>
-                              <a:chOff x="0" y="0"/>
-                              <a:chExt cx="5903463" cy="1486894"/>
+                              <a:chOff x="2055725" y="3036725"/>
+                              <a:chExt cx="6580550" cy="1486550"/>
                             </a:xfrm>
                           </wpg:grpSpPr>
                           <wps:wsp>
@@ -97,8 +96,8 @@
                             <wps:cNvPr id="5" name="Shape 5"/>
                             <wps:spPr>
                               <a:xfrm>
-                                <a:off x="0" y="0"/>
-                                <a:ext cx="5903450" cy="1486875"/>
+                                <a:off x="2055725" y="3036725"/>
+                                <a:ext cx="6580550" cy="1486550"/>
                               </a:xfrm>
                               <a:prstGeom prst="rect">
                                 <a:avLst/>
@@ -124,126 +123,181 @@
                               <a:noAutofit/>
                             </wps:bodyPr>
                           </wps:wsp>
-                          <wps:wsp>
-                            <wps:cNvSpPr/>
-                            <wps:cNvPr id="6" name="Shape 6"/>
-                            <wps:spPr>
+                          <wpg:grpSp>
+                            <wpg:cNvGrpSpPr/>
+                            <wpg:grpSpPr>
                               <a:xfrm>
-                                <a:off x="1024758" y="239160"/>
-                                <a:ext cx="4878705" cy="1236313"/>
+                                <a:off x="2055748" y="3036733"/>
+                                <a:ext cx="6580505" cy="1486535"/>
+                                <a:chOff x="0" y="0"/>
+                                <a:chExt cx="5903463" cy="1486894"/>
                               </a:xfrm>
-                              <a:prstGeom prst="rect">
-                                <a:avLst/>
-                              </a:prstGeom>
-                              <a:noFill/>
-                              <a:ln>
+                            </wpg:grpSpPr>
+                            <wps:wsp>
+                              <wps:cNvSpPr/>
+                              <wps:cNvPr id="7" name="Shape 7"/>
+                              <wps:spPr>
+                                <a:xfrm>
+                                  <a:off x="0" y="0"/>
+                                  <a:ext cx="5903450" cy="1486875"/>
+                                </a:xfrm>
+                                <a:prstGeom prst="rect">
+                                  <a:avLst/>
+                                </a:prstGeom>
                                 <a:noFill/>
-                              </a:ln>
-                            </wps:spPr>
-                            <wps:txbx>
-                              <w:txbxContent>
-                                <w:p>
-                                  <w:pPr>
-                                    <w:spacing w:after="0" w:before="0" w:line="240"/>
-                                    <w:ind w:left="0" w:right="0" w:firstLine="0"/>
-                                    <w:jc w:val="left"/>
-                                    <w:textDirection w:val="btLr"/>
-                                  </w:pPr>
-                                </w:p>
-                                <w:p>
-                                  <w:pPr>
-                                    <w:spacing w:after="0" w:before="0" w:line="240"/>
-                                    <w:ind w:left="0" w:right="0" w:firstLine="0"/>
-                                    <w:jc w:val="left"/>
-                                    <w:textDirection w:val="btLr"/>
-                                  </w:pPr>
-                                  <w:r>
-                                    <w:rPr>
-                                      <w:rFonts w:ascii="Arial" w:cs="Arial" w:eastAsia="Arial" w:hAnsi="Arial"/>
-                                      <w:b w:val="0"/>
-                                      <w:i w:val="0"/>
-                                      <w:smallCaps w:val="0"/>
-                                      <w:strike w:val="0"/>
-                                      <w:color w:val="000000"/>
-                                      <w:sz w:val="28"/>
-                                      <w:vertAlign w:val="baseline"/>
-                                    </w:rPr>
-                                  </w:r>
-                                  <w:r>
-                                    <w:rPr>
-                                      <w:rFonts w:ascii="Calibri" w:cs="Calibri" w:eastAsia="Calibri" w:hAnsi="Calibri"/>
-                                      <w:b w:val="1"/>
-                                      <w:i w:val="0"/>
-                                      <w:smallCaps w:val="0"/>
-                                      <w:strike w:val="0"/>
-                                      <w:color w:val="1f3864"/>
-                                      <w:sz w:val="48"/>
-                                      <w:vertAlign w:val="baseline"/>
-                                    </w:rPr>
-                                    <w:t xml:space="preserve">Guía1. Definición Proyecto APT </w:t>
-                                  </w:r>
-                                </w:p>
-                                <w:p>
-                                  <w:pPr>
-                                    <w:spacing w:after="0" w:before="0" w:line="240"/>
-                                    <w:ind w:left="0" w:right="0" w:firstLine="0"/>
-                                    <w:jc w:val="left"/>
-                                    <w:textDirection w:val="btLr"/>
-                                  </w:pPr>
-                                  <w:r>
-                                    <w:rPr>
-                                      <w:rFonts w:ascii="Calibri" w:cs="Calibri" w:eastAsia="Calibri" w:hAnsi="Calibri"/>
-                                      <w:b w:val="1"/>
-                                      <w:i w:val="0"/>
-                                      <w:smallCaps w:val="0"/>
-                                      <w:strike w:val="0"/>
-                                      <w:color w:val="1f3864"/>
-                                      <w:sz w:val="48"/>
-                                      <w:vertAlign w:val="baseline"/>
-                                    </w:rPr>
-                                    <w:t xml:space="preserve">Asignatura Capstone</w:t>
-                                  </w:r>
-                                </w:p>
-                              </w:txbxContent>
-                            </wps:txbx>
-                            <wps:bodyPr anchorCtr="0" anchor="t" bIns="45700" lIns="91425" spcFirstLastPara="1" rIns="91425" wrap="square" tIns="45700">
-                              <a:noAutofit/>
-                            </wps:bodyPr>
-                          </wps:wsp>
-                          <wps:wsp>
-                            <wps:cNvSpPr/>
-                            <wps:cNvPr id="7" name="Shape 7"/>
-                            <wps:spPr>
-                              <a:xfrm>
-                                <a:off x="0" y="0"/>
-                                <a:ext cx="993140" cy="1486894"/>
-                              </a:xfrm>
-                              <a:prstGeom prst="rect">
-                                <a:avLst/>
-                              </a:prstGeom>
-                              <a:solidFill>
-                                <a:srgbClr val="1F3864"/>
-                              </a:solidFill>
-                              <a:ln>
+                                <a:ln>
+                                  <a:noFill/>
+                                </a:ln>
+                              </wps:spPr>
+                              <wps:txbx>
+                                <w:txbxContent>
+                                  <w:p>
+                                    <w:pPr>
+                                      <w:spacing w:after="0" w:before="0" w:line="240"/>
+                                      <w:ind w:left="0" w:right="0" w:firstLine="0"/>
+                                      <w:jc w:val="left"/>
+                                      <w:textDirection w:val="btLr"/>
+                                    </w:pPr>
+                                  </w:p>
+                                </w:txbxContent>
+                              </wps:txbx>
+                              <wps:bodyPr anchorCtr="0" anchor="ctr" bIns="91425" lIns="91425" spcFirstLastPara="1" rIns="91425" wrap="square" tIns="91425">
+                                <a:noAutofit/>
+                              </wps:bodyPr>
+                            </wps:wsp>
+                            <wps:wsp>
+                              <wps:cNvSpPr/>
+                              <wps:cNvPr id="8" name="Shape 8"/>
+                              <wps:spPr>
+                                <a:xfrm>
+                                  <a:off x="1024758" y="239160"/>
+                                  <a:ext cx="4878705" cy="1236313"/>
+                                </a:xfrm>
+                                <a:prstGeom prst="rect">
+                                  <a:avLst/>
+                                </a:prstGeom>
                                 <a:noFill/>
-                              </a:ln>
-                            </wps:spPr>
-                            <wps:txbx>
-                              <w:txbxContent>
-                                <w:p>
-                                  <w:pPr>
-                                    <w:spacing w:after="0" w:before="0" w:line="240"/>
-                                    <w:ind w:left="0" w:right="0" w:firstLine="0"/>
-                                    <w:jc w:val="left"/>
-                                    <w:textDirection w:val="btLr"/>
-                                  </w:pPr>
-                                </w:p>
-                              </w:txbxContent>
-                            </wps:txbx>
-                            <wps:bodyPr anchorCtr="0" anchor="ctr" bIns="91425" lIns="91425" spcFirstLastPara="1" rIns="91425" wrap="square" tIns="91425">
-                              <a:noAutofit/>
-                            </wps:bodyPr>
-                          </wps:wsp>
+                                <a:ln>
+                                  <a:noFill/>
+                                </a:ln>
+                              </wps:spPr>
+                              <wps:txbx>
+                                <w:txbxContent>
+                                  <w:p>
+                                    <w:pPr>
+                                      <w:spacing w:after="0" w:before="0" w:line="240"/>
+                                      <w:ind w:left="0" w:right="0" w:firstLine="0"/>
+                                      <w:jc w:val="left"/>
+                                      <w:textDirection w:val="btLr"/>
+                                    </w:pPr>
+                                  </w:p>
+                                  <w:p>
+                                    <w:pPr>
+                                      <w:spacing w:after="0" w:before="0" w:line="240"/>
+                                      <w:ind w:left="0" w:right="0" w:firstLine="0"/>
+                                      <w:jc w:val="left"/>
+                                      <w:textDirection w:val="btLr"/>
+                                    </w:pPr>
+                                    <w:r>
+                                      <w:rPr>
+                                        <w:rFonts w:ascii="Arial" w:cs="Arial" w:eastAsia="Arial" w:hAnsi="Arial"/>
+                                        <w:b w:val="0"/>
+                                        <w:i w:val="0"/>
+                                        <w:smallCaps w:val="0"/>
+                                        <w:strike w:val="0"/>
+                                        <w:color w:val="000000"/>
+                                        <w:sz w:val="28"/>
+                                        <w:vertAlign w:val="baseline"/>
+                                      </w:rPr>
+                                    </w:r>
+                                    <w:r>
+                                      <w:rPr>
+                                        <w:rFonts w:ascii="Calibri" w:cs="Calibri" w:eastAsia="Calibri" w:hAnsi="Calibri"/>
+                                        <w:b w:val="1"/>
+                                        <w:i w:val="0"/>
+                                        <w:smallCaps w:val="0"/>
+                                        <w:strike w:val="0"/>
+                                        <w:color w:val="1f3864"/>
+                                        <w:sz w:val="48"/>
+                                        <w:vertAlign w:val="baseline"/>
+                                      </w:rPr>
+                                      <w:t xml:space="preserve">Guía1. Definición Proyecto APT </w:t>
+                                    </w:r>
+                                  </w:p>
+                                  <w:p>
+                                    <w:pPr>
+                                      <w:spacing w:after="0" w:before="0" w:line="240"/>
+                                      <w:ind w:left="0" w:right="0" w:firstLine="0"/>
+                                      <w:jc w:val="left"/>
+                                      <w:textDirection w:val="btLr"/>
+                                    </w:pPr>
+                                    <w:r>
+                                      <w:rPr>
+                                        <w:rFonts w:ascii="Calibri" w:cs="Calibri" w:eastAsia="Calibri" w:hAnsi="Calibri"/>
+                                        <w:b w:val="1"/>
+                                        <w:i w:val="0"/>
+                                        <w:smallCaps w:val="0"/>
+                                        <w:strike w:val="0"/>
+                                        <w:color w:val="1f3864"/>
+                                        <w:sz w:val="48"/>
+                                        <w:vertAlign w:val="baseline"/>
+                                      </w:rPr>
+                                    </w:r>
+                                    <w:r>
+                                      <w:rPr>
+                                        <w:rFonts w:ascii="Calibri" w:cs="Calibri" w:eastAsia="Calibri" w:hAnsi="Calibri"/>
+                                        <w:b w:val="1"/>
+                                        <w:i w:val="0"/>
+                                        <w:smallCaps w:val="0"/>
+                                        <w:strike w:val="0"/>
+                                        <w:color w:val="1f3864"/>
+                                        <w:sz w:val="48"/>
+                                        <w:vertAlign w:val="baseline"/>
+                                      </w:rPr>
+                                      <w:t xml:space="preserve">Asignatura Capstone</w:t>
+                                    </w:r>
+                                  </w:p>
+                                </w:txbxContent>
+                              </wps:txbx>
+                              <wps:bodyPr anchorCtr="0" anchor="t" bIns="45700" lIns="91425" spcFirstLastPara="1" rIns="91425" wrap="square" tIns="45700">
+                                <a:noAutofit/>
+                              </wps:bodyPr>
+                            </wps:wsp>
+                            <wps:wsp>
+                              <wps:cNvSpPr/>
+                              <wps:cNvPr id="9" name="Shape 9"/>
+                              <wps:spPr>
+                                <a:xfrm>
+                                  <a:off x="0" y="0"/>
+                                  <a:ext cx="993140" cy="1486894"/>
+                                </a:xfrm>
+                                <a:prstGeom prst="rect">
+                                  <a:avLst/>
+                                </a:prstGeom>
+                                <a:solidFill>
+                                  <a:srgbClr val="1F3864"/>
+                                </a:solidFill>
+                                <a:ln>
+                                  <a:noFill/>
+                                </a:ln>
+                              </wps:spPr>
+                              <wps:txbx>
+                                <w:txbxContent>
+                                  <w:p>
+                                    <w:pPr>
+                                      <w:spacing w:after="0" w:before="0" w:line="240"/>
+                                      <w:ind w:left="0" w:right="0" w:firstLine="0"/>
+                                      <w:jc w:val="left"/>
+                                      <w:textDirection w:val="btLr"/>
+                                    </w:pPr>
+                                  </w:p>
+                                </w:txbxContent>
+                              </wps:txbx>
+                              <wps:bodyPr anchorCtr="0" anchor="ctr" bIns="91425" lIns="91425" spcFirstLastPara="1" rIns="91425" wrap="square" tIns="91425">
+                                <a:noAutofit/>
+                              </wps:bodyPr>
+                            </wps:wsp>
+                          </wpg:grpSp>
                         </wpg:grpSp>
                       </wpg:grpSp>
                     </wpg:wgp>
@@ -257,7 +311,7 @@
               <wp:anchor allowOverlap="1" behindDoc="0" distB="0" distT="0" distL="114300" distR="114300" hidden="0" layoutInCell="1" locked="0" relativeHeight="0" simplePos="0">
                 <wp:simplePos x="0" y="0"/>
                 <wp:positionH relativeFrom="column">
-                  <wp:posOffset>-435397</wp:posOffset>
+                  <wp:posOffset>-435396</wp:posOffset>
                 </wp:positionH>
                 <wp:positionV relativeFrom="paragraph">
                   <wp:posOffset>33444</wp:posOffset>
@@ -265,7 +319,7 @@
                 <wp:extent cx="6580505" cy="1486535"/>
                 <wp:effectExtent b="0" l="0" r="0" t="0"/>
                 <wp:wrapNone/>
-                <wp:docPr id="50" name="image2.png"/>
+                <wp:docPr id="52" name="image2.png"/>
                 <a:graphic>
                   <a:graphicData uri="http://schemas.openxmlformats.org/drawingml/2006/picture">
                     <pic:pic>
@@ -295,6 +349,27 @@
             </w:drawing>
           </mc:Fallback>
         </mc:AlternateContent>
+      </w:r>
+    </w:p>
+    <w:p>
+      <w:pPr>
+        <w:rPr/>
+      </w:pPr>
+      <w:r>
+        <w:rPr>
+          <w:rtl w:val="0"/>
+        </w:rPr>
+      </w:r>
+    </w:p>
+    <w:p>
+      <w:pPr>
+        <w:rPr/>
+      </w:pPr>
+      <w:r>
+        <w:rPr>
+          <w:rtl w:val="0"/>
+        </w:rPr>
+        <w:t xml:space="preserve">}</w:t>
       </w:r>
     </w:p>
     <w:p>
@@ -1110,7 +1185,7 @@
                 <w:bCs w:val="1"/>
                 <w:rtl w:val="0"/>
               </w:rPr>
-              <w:t xml:space="preserve">Fabian Araya Aredondo</w:t>
+              <w:t xml:space="preserve">Fabian Araya Arredondo</w:t>
             </w:r>
           </w:p>
         </w:tc>
@@ -1512,6 +1587,11 @@
                 <w:rtl w:val="0"/>
               </w:rPr>
               <w:t xml:space="preserve">Automatización de Conciliaciones Contables — Hotel Plaza San Francisco</w:t>
+            </w:r>
+            <w:r>
+              <w:rPr>
+                <w:rtl w:val="0"/>
+              </w:rPr>
             </w:r>
           </w:p>
         </w:tc>
@@ -3020,7 +3100,7 @@
                 <w:rFonts w:ascii="Calibri" w:cs="Calibri" w:eastAsia="Calibri" w:hAnsi="Calibri"/>
                 <w:rtl w:val="0"/>
               </w:rPr>
-              <w:t>Levantar y documentar el flujo contable actual, identificando las reglas de negocio y las llaves de cruce (código de autorización, número de documento, monto). Diseñar un modelo de datos que estructure la cartola bancaria, los reportes Transbank y el borderó del ERP, incluyendo el tratamiento de su formato paginado. Desarrollar un motor de validación que cruce automáticamente los registros aplicando un parámetro de tolerancia definido. Clasificar automáticamente los tipos de anomalía detectados (desfases de tiempo, agrupación de pagos, errores de tipeo, notas de crédito). Generar un reporte único de excepciones para el analista contable. Validar el funcionamiento del sistema con los insumos reales del hotel.</w:t>
+              <w:t xml:space="preserve">Levantar y documentar el flujo contable actual, identificando las reglas de negocio y las llaves de cruce (código de autorización, número de documento, monto). Diseñar un modelo de datos que estructure la cartola bancaria, los reportes Transbank y el borderó del ERP, incluyendo el tratamiento de su formato paginado. Desarrollar un motor de validación que cruce automáticamente los registros aplicando un parámetro de tolerancia definido. Clasificar automáticamente los tipos de anomalía detectados (desfases de tiempo, agrupación de pagos, errores de tipeo, notas de crédito). Generar un reporte único de excepciones para el analista contable. Validar el funcionamiento del sistema con los insumos reales del hotel.</w:t>
             </w:r>
             <w:r>
               <w:rPr>
@@ -3288,7 +3368,7 @@
                 <w:rFonts w:ascii="Calibri" w:cs="Calibri" w:eastAsia="Calibri" w:hAnsi="Calibri"/>
                 <w:rtl w:val="0"/>
               </w:rPr>
-              <w:t>El proyecto se abordó bajo una metodología ágil, organizada en 5 sprints. En el Sprint 1 se realizaron reuniones con el hotel para levantar el proceso contable actual, identificando las fuentes de información (cartola bancaria, reportes Transbank y borderó del ERP/FrontOffice) y las llaves de negocio usadas para el cruce. En el Sprint 2 se diseñó el modelo de datos y se definió cómo normalizar los distintos formatos de entrada, incluyendo el borderó paginado. En el Sprint 3 se desarrolló el motor de validación que cruza los registros aplicando un parámetro de tolerancia. En el Sprint 4 se implementó la clasificación automática de anomalías y la generación del reporte de excepciones. En el Sprint 5 se evaluó el prototipo con los insumos reales del hotel, comparando sus resultados contra el proceso manual y aplicando mejoras.</w:t>
+              <w:t xml:space="preserve">El proyecto se abordó bajo una metodología ágil, organizada en 5 sprints. En el Sprint 1 se realizaron reuniones con el hotel para levantar el proceso contable actual, identificando las fuentes de información (cartola bancaria, reportes Transbank y borderó del ERP/FrontOffice) y las llaves de negocio usadas para el cruce. En el Sprint 2 se diseñó el modelo de datos y se definió cómo normalizar los distintos formatos de entrada, incluyendo el borderó paginado. En el Sprint 3 se desarrolló el motor de validación que cruza los registros aplicando un parámetro de tolerancia. En el Sprint 4 se implementó la clasificación automática de anomalías y la generación del reporte de excepciones. En el Sprint 5 se evaluó el prototipo con los insumos reales del hotel, comparando sus resultados contra el proceso manual y aplicando mejoras.</w:t>
             </w:r>
             <w:r>
               <w:rPr>
@@ -5365,7 +5445,7 @@
                 <w:rFonts w:ascii="Calibri" w:cs="Calibri" w:eastAsia="Calibri" w:hAnsi="Calibri"/>
                 <w:rtl w:val="0"/>
               </w:rPr>
-              <w:t>Diseño y Gestión de Requisitos; Modelamiento de Base de Datos</w:t>
+              <w:t xml:space="preserve">Diseño y Gestión de Requisitos; Modelamiento de Base de Datos</w:t>
             </w:r>
             <w:r>
               <w:rPr>
@@ -5485,7 +5565,7 @@
                 <w:rFonts w:ascii="Calibri" w:cs="Calibri" w:eastAsia="Calibri" w:hAnsi="Calibri"/>
                 <w:rtl w:val="0"/>
               </w:rPr>
-              <w:t>4 semanas</w:t>
+              <w:t xml:space="preserve">4 semanas</w:t>
             </w:r>
             <w:r>
               <w:rPr>
@@ -5583,7 +5663,7 @@
                 <w:rFonts w:ascii="Calibri" w:cs="Calibri" w:eastAsia="Calibri" w:hAnsi="Calibri"/>
                 <w:rtl w:val="0"/>
               </w:rPr>
-              <w:t>Programación Web; Consulta y Programación de Base de Datos; Calidad de Software</w:t>
+              <w:t xml:space="preserve">Programación Web; Consulta y Programación de Base de Datos; Calidad de Software</w:t>
             </w:r>
             <w:r>
               <w:rPr>
@@ -5612,7 +5692,7 @@
                 <w:rFonts w:ascii="Calibri" w:cs="Calibri" w:eastAsia="Calibri" w:hAnsi="Calibri"/>
                 <w:rtl w:val="0"/>
               </w:rPr>
-              <w:t>Construcción, evaluación y mejora del prototipo (Sprint 3, 4 y 5)</w:t>
+              <w:t xml:space="preserve">Construcción, evaluación y mejora del prototipo (Sprint 3, 4 y 5)</w:t>
             </w:r>
             <w:r>
               <w:rPr>
@@ -5641,7 +5721,7 @@
                 <w:rFonts w:ascii="Calibri" w:cs="Calibri" w:eastAsia="Calibri" w:hAnsi="Calibri"/>
                 <w:rtl w:val="0"/>
               </w:rPr>
-              <w:t>Desarrollo del motor de validación con tolerancia parametrizable (Sprint 3); clasificación de anomalías y generación del reporte de excepciones (Sprint 4); evaluación del prototipo con datos reales y aplicación de mejoras (Sprint 5).</w:t>
+              <w:t xml:space="preserve">Desarrollo del motor de validación con tolerancia parametrizable (Sprint 3); clasificación de anomalías y generación del reporte de excepciones (Sprint 4); evaluación del prototipo con datos reales y aplicación de mejoras (Sprint 5).</w:t>
             </w:r>
             <w:r>
               <w:rPr>
@@ -5670,7 +5750,7 @@
                 <w:rFonts w:ascii="Calibri" w:cs="Calibri" w:eastAsia="Calibri" w:hAnsi="Calibri"/>
                 <w:rtl w:val="0"/>
               </w:rPr>
-              <w:t>Equipo computacional, lenguaje/framework de desarrollo, archivos de prueba.</w:t>
+              <w:t xml:space="preserve">Equipo computacional, lenguaje/framework de desarrollo, archivos de prueba.</w:t>
             </w:r>
             <w:r>
               <w:rPr>
@@ -5703,7 +5783,7 @@
                 <w:rFonts w:ascii="Calibri" w:cs="Calibri" w:eastAsia="Calibri" w:hAnsi="Calibri"/>
                 <w:rtl w:val="0"/>
               </w:rPr>
-              <w:t>14 semanas</w:t>
+              <w:t xml:space="preserve">14 semanas</w:t>
             </w:r>
             <w:r>
               <w:rPr>
@@ -5737,7 +5817,7 @@
                 <w:rFonts w:ascii="Calibri" w:cs="Calibri" w:eastAsia="Calibri" w:hAnsi="Calibri"/>
                 <w:rtl w:val="0"/>
               </w:rPr>
-              <w:t>Diego Reyes, Eva González, Fabián Araya</w:t>
+              <w:t xml:space="preserve">Diego Reyes, Eva González, Fabián Araya</w:t>
             </w:r>
             <w:r>
               <w:rPr>
@@ -5766,7 +5846,7 @@
                 <w:rFonts w:ascii="Calibri" w:cs="Calibri" w:eastAsia="Calibri" w:hAnsi="Calibri"/>
                 <w:rtl w:val="0"/>
               </w:rPr>
-              <w:t>Se optó temporalmente por una aplicación web para facilitar las evaluaciones.</w:t>
+              <w:t xml:space="preserve">Se optó temporalmente por una aplicación web para facilitar las evaluaciones.</w:t>
             </w:r>
             <w:r>
               <w:rPr>
@@ -7107,7 +7187,7 @@
                 <w:szCs w:val="16"/>
                 <w:rtl w:val="0"/>
               </w:rPr>
-              <w:t>Desarrollo del motor de validación y cruce de datos (Sprint 3)</w:t>
+              <w:t xml:space="preserve">Desarrollo del motor de validación y cruce de datos (Sprint 3)</w:t>
             </w:r>
             <w:r>
               <w:rPr>
@@ -7344,16 +7424,6 @@
             </w:pPr>
             <w:r>
               <w:rPr>
-                <w:rFonts w:ascii="Calibri" w:cs="Calibri" w:eastAsia="Calibri" w:hAnsi="Calibri"/>
-                <w:b w:val="1"/>
-                <w:bCs w:val="1"/>
-                <w:sz w:val="16"/>
-                <w:szCs w:val="16"/>
-                <w:rtl w:val="0"/>
-              </w:rPr>
-            </w:r>
-            <w:r>
-              <w:rPr>
                 <w:rtl w:val="0"/>
               </w:rPr>
             </w:r>
@@ -7375,16 +7445,6 @@
             </w:pPr>
             <w:r>
               <w:rPr>
-                <w:rFonts w:ascii="Calibri" w:cs="Calibri" w:eastAsia="Calibri" w:hAnsi="Calibri"/>
-                <w:b w:val="1"/>
-                <w:bCs w:val="1"/>
-                <w:sz w:val="16"/>
-                <w:szCs w:val="16"/>
-                <w:rtl w:val="0"/>
-              </w:rPr>
-            </w:r>
-            <w:r>
-              <w:rPr>
                 <w:rtl w:val="0"/>
               </w:rPr>
             </w:r>
@@ -7406,16 +7466,6 @@
             </w:pPr>
             <w:r>
               <w:rPr>
-                <w:rFonts w:ascii="Calibri" w:cs="Calibri" w:eastAsia="Calibri" w:hAnsi="Calibri"/>
-                <w:b w:val="1"/>
-                <w:bCs w:val="1"/>
-                <w:sz w:val="16"/>
-                <w:szCs w:val="16"/>
-                <w:rtl w:val="0"/>
-              </w:rPr>
-            </w:r>
-            <w:r>
-              <w:rPr>
                 <w:rtl w:val="0"/>
               </w:rPr>
             </w:r>
@@ -7435,16 +7485,6 @@
                 <w:highlight w:val="yellow"/>
               </w:rPr>
             </w:pPr>
-            <w:r>
-              <w:rPr>
-                <w:rFonts w:ascii="Calibri" w:cs="Calibri" w:eastAsia="Calibri" w:hAnsi="Calibri"/>
-                <w:b w:val="1"/>
-                <w:bCs w:val="1"/>
-                <w:sz w:val="16"/>
-                <w:szCs w:val="16"/>
-                <w:rtl w:val="0"/>
-              </w:rPr>
-            </w:r>
             <w:r>
               <w:rPr>
                 <w:rtl w:val="0"/>
@@ -7610,7 +7650,7 @@
                 <w:szCs w:val="16"/>
                 <w:rtl w:val="0"/>
               </w:rPr>
-              <w:t>Implementación de clasificación de anomalías y generación del reporte de excepciones (Sprint 4)</w:t>
+              <w:t xml:space="preserve">Implementación de clasificación de anomalías y generación del reporte de excepciones (Sprint 4)</w:t>
             </w:r>
             <w:r>
               <w:rPr>
@@ -7719,16 +7759,6 @@
             </w:pPr>
             <w:r>
               <w:rPr>
-                <w:rFonts w:ascii="Calibri" w:cs="Calibri" w:eastAsia="Calibri" w:hAnsi="Calibri"/>
-                <w:b w:val="1"/>
-                <w:bCs w:val="1"/>
-                <w:sz w:val="16"/>
-                <w:szCs w:val="16"/>
-                <w:rtl w:val="0"/>
-              </w:rPr>
-            </w:r>
-            <w:r>
-              <w:rPr>
                 <w:rtl w:val="0"/>
               </w:rPr>
             </w:r>
@@ -7750,16 +7780,6 @@
             </w:pPr>
             <w:r>
               <w:rPr>
-                <w:rFonts w:ascii="Calibri" w:cs="Calibri" w:eastAsia="Calibri" w:hAnsi="Calibri"/>
-                <w:b w:val="1"/>
-                <w:bCs w:val="1"/>
-                <w:sz w:val="16"/>
-                <w:szCs w:val="16"/>
-                <w:rtl w:val="0"/>
-              </w:rPr>
-            </w:r>
-            <w:r>
-              <w:rPr>
                 <w:rtl w:val="0"/>
               </w:rPr>
             </w:r>
@@ -7781,16 +7801,6 @@
             </w:pPr>
             <w:r>
               <w:rPr>
-                <w:rFonts w:ascii="Calibri" w:cs="Calibri" w:eastAsia="Calibri" w:hAnsi="Calibri"/>
-                <w:b w:val="1"/>
-                <w:bCs w:val="1"/>
-                <w:sz w:val="16"/>
-                <w:szCs w:val="16"/>
-                <w:rtl w:val="0"/>
-              </w:rPr>
-            </w:r>
-            <w:r>
-              <w:rPr>
                 <w:rtl w:val="0"/>
               </w:rPr>
             </w:r>
@@ -7810,16 +7820,6 @@
                 <w:highlight w:val="yellow"/>
               </w:rPr>
             </w:pPr>
-            <w:r>
-              <w:rPr>
-                <w:rFonts w:ascii="Calibri" w:cs="Calibri" w:eastAsia="Calibri" w:hAnsi="Calibri"/>
-                <w:b w:val="1"/>
-                <w:bCs w:val="1"/>
-                <w:sz w:val="16"/>
-                <w:szCs w:val="16"/>
-                <w:rtl w:val="0"/>
-              </w:rPr>
-            </w:r>
             <w:r>
               <w:rPr>
                 <w:rtl w:val="0"/>
@@ -8112,7 +8112,7 @@
                 <w:szCs w:val="16"/>
                 <w:rtl w:val="0"/>
               </w:rPr>
-              <w:t>Evaluación y mejoras (Sprint 5)</w:t>
+              <w:t xml:space="preserve">Evaluación y mejoras (Sprint 5)</w:t>
             </w:r>
             <w:r>
               <w:rPr>
@@ -8815,7 +8815,7 @@
               <wp:inline distB="0" distT="0" distL="0" distR="0">
                 <wp:extent cx="1996440" cy="428625"/>
                 <wp:effectExtent b="0" l="0" r="0" t="0"/>
-                <wp:docPr descr="http://www.duoc.cl/normasgraficas/normasgraficas/marca-duoc/6logo-fondo-transparente/fondo-transparente.png" id="51" name="image1.png"/>
+                <wp:docPr descr="http://www.duoc.cl/normasgraficas/normasgraficas/marca-duoc/6logo-fondo-transparente/fondo-transparente.png" id="53" name="image1.png"/>
                 <a:graphic>
                   <a:graphicData uri="http://schemas.openxmlformats.org/drawingml/2006/picture">
                     <pic:pic>
@@ -9355,6 +9355,20 @@
   <w:style w:type="paragraph" w:styleId="Normal" w:default="1">
     <w:name w:val="normal"/>
   </w:style>
+  <w:style w:type="table" w:styleId="TableNormal" w:default="1">
+    <w:name w:val="TableNormal"/>
+    <w:tblPr>
+      <w:tblCellMar>
+        <w:top w:w="100.0" w:type="dxa"/>
+        <w:left w:w="100.0" w:type="dxa"/>
+        <w:bottom w:w="100.0" w:type="dxa"/>
+        <w:right w:w="100.0" w:type="dxa"/>
+      </w:tblCellMar>
+    </w:tblPr>
+  </w:style>
+  <w:style w:type="paragraph" w:styleId="Normal" w:default="1">
+    <w:name w:val="normal"/>
+  </w:style>
   <w:style w:type="character" w:styleId="Fuentedeprrafopredeter" w:default="1">
     <w:name w:val="Default Paragraph Font"/>
     <w:uiPriority w:val="1"/>
@@ -9642,6 +9656,329 @@
       <w:sz w:val="20"/>
       <w:szCs w:val="20"/>
     </w:rPr>
+  </w:style>
+  <w:style w:type="table" w:styleId="Table1">
+    <w:basedOn w:val="TableNormal"/>
+    <w:rPr>
+      <w:sz w:val="22"/>
+      <w:szCs w:val="22"/>
+    </w:rPr>
+    <w:tblPr>
+      <w:tblStyleRowBandSize w:val="1"/>
+      <w:tblStyleColBandSize w:val="1"/>
+      <w:tblCellMar>
+        <w:top w:w="0.0" w:type="dxa"/>
+        <w:left w:w="108.0" w:type="dxa"/>
+        <w:bottom w:w="0.0" w:type="dxa"/>
+        <w:right w:w="108.0" w:type="dxa"/>
+      </w:tblCellMar>
+    </w:tblPr>
+  </w:style>
+  <w:style w:type="table" w:styleId="Table2">
+    <w:basedOn w:val="TableNormal"/>
+    <w:rPr>
+      <w:sz w:val="22"/>
+      <w:szCs w:val="22"/>
+    </w:rPr>
+    <w:tblPr>
+      <w:tblStyleRowBandSize w:val="1"/>
+      <w:tblStyleColBandSize w:val="1"/>
+      <w:tblCellMar>
+        <w:top w:w="0.0" w:type="dxa"/>
+        <w:left w:w="108.0" w:type="dxa"/>
+        <w:bottom w:w="0.0" w:type="dxa"/>
+        <w:right w:w="108.0" w:type="dxa"/>
+      </w:tblCellMar>
+    </w:tblPr>
+  </w:style>
+  <w:style w:type="table" w:styleId="Table3">
+    <w:basedOn w:val="TableNormal"/>
+    <w:rPr>
+      <w:sz w:val="22"/>
+      <w:szCs w:val="22"/>
+    </w:rPr>
+    <w:tblPr>
+      <w:tblStyleRowBandSize w:val="1"/>
+      <w:tblStyleColBandSize w:val="1"/>
+      <w:tblCellMar>
+        <w:top w:w="0.0" w:type="dxa"/>
+        <w:left w:w="108.0" w:type="dxa"/>
+        <w:bottom w:w="0.0" w:type="dxa"/>
+        <w:right w:w="108.0" w:type="dxa"/>
+      </w:tblCellMar>
+    </w:tblPr>
+  </w:style>
+  <w:style w:type="table" w:styleId="Table4">
+    <w:basedOn w:val="TableNormal"/>
+    <w:rPr>
+      <w:sz w:val="22"/>
+      <w:szCs w:val="22"/>
+    </w:rPr>
+    <w:tblPr>
+      <w:tblStyleRowBandSize w:val="1"/>
+      <w:tblStyleColBandSize w:val="1"/>
+      <w:tblCellMar>
+        <w:top w:w="0.0" w:type="dxa"/>
+        <w:left w:w="108.0" w:type="dxa"/>
+        <w:bottom w:w="0.0" w:type="dxa"/>
+        <w:right w:w="108.0" w:type="dxa"/>
+      </w:tblCellMar>
+    </w:tblPr>
+  </w:style>
+  <w:style w:type="table" w:styleId="Table5">
+    <w:basedOn w:val="TableNormal"/>
+    <w:rPr>
+      <w:sz w:val="22"/>
+      <w:szCs w:val="22"/>
+    </w:rPr>
+    <w:tblPr>
+      <w:tblStyleRowBandSize w:val="1"/>
+      <w:tblStyleColBandSize w:val="1"/>
+      <w:tblCellMar>
+        <w:top w:w="0.0" w:type="dxa"/>
+        <w:left w:w="108.0" w:type="dxa"/>
+        <w:bottom w:w="0.0" w:type="dxa"/>
+        <w:right w:w="108.0" w:type="dxa"/>
+      </w:tblCellMar>
+    </w:tblPr>
+  </w:style>
+  <w:style w:type="table" w:styleId="Table6">
+    <w:basedOn w:val="TableNormal"/>
+    <w:rPr>
+      <w:sz w:val="22"/>
+      <w:szCs w:val="22"/>
+    </w:rPr>
+    <w:tblPr>
+      <w:tblStyleRowBandSize w:val="1"/>
+      <w:tblStyleColBandSize w:val="1"/>
+      <w:tblCellMar>
+        <w:top w:w="0.0" w:type="dxa"/>
+        <w:left w:w="108.0" w:type="dxa"/>
+        <w:bottom w:w="0.0" w:type="dxa"/>
+        <w:right w:w="108.0" w:type="dxa"/>
+      </w:tblCellMar>
+    </w:tblPr>
+  </w:style>
+  <w:style w:type="table" w:styleId="Table7">
+    <w:basedOn w:val="TableNormal"/>
+    <w:rPr>
+      <w:sz w:val="22"/>
+      <w:szCs w:val="22"/>
+    </w:rPr>
+    <w:tblPr>
+      <w:tblStyleRowBandSize w:val="1"/>
+      <w:tblStyleColBandSize w:val="1"/>
+      <w:tblCellMar>
+        <w:top w:w="0.0" w:type="dxa"/>
+        <w:left w:w="108.0" w:type="dxa"/>
+        <w:bottom w:w="0.0" w:type="dxa"/>
+        <w:right w:w="108.0" w:type="dxa"/>
+      </w:tblCellMar>
+    </w:tblPr>
+  </w:style>
+  <w:style w:type="table" w:styleId="Table8">
+    <w:basedOn w:val="TableNormal"/>
+    <w:rPr>
+      <w:sz w:val="22"/>
+      <w:szCs w:val="22"/>
+    </w:rPr>
+    <w:tblPr>
+      <w:tblStyleRowBandSize w:val="1"/>
+      <w:tblStyleColBandSize w:val="1"/>
+      <w:tblCellMar>
+        <w:top w:w="0.0" w:type="dxa"/>
+        <w:left w:w="108.0" w:type="dxa"/>
+        <w:bottom w:w="0.0" w:type="dxa"/>
+        <w:right w:w="108.0" w:type="dxa"/>
+      </w:tblCellMar>
+    </w:tblPr>
+  </w:style>
+  <w:style w:type="table" w:styleId="Table9">
+    <w:basedOn w:val="TableNormal"/>
+    <w:rPr>
+      <w:sz w:val="22"/>
+      <w:szCs w:val="22"/>
+    </w:rPr>
+    <w:tblPr>
+      <w:tblStyleRowBandSize w:val="1"/>
+      <w:tblStyleColBandSize w:val="1"/>
+      <w:tblCellMar>
+        <w:top w:w="0.0" w:type="dxa"/>
+        <w:left w:w="108.0" w:type="dxa"/>
+        <w:bottom w:w="0.0" w:type="dxa"/>
+        <w:right w:w="108.0" w:type="dxa"/>
+      </w:tblCellMar>
+    </w:tblPr>
+  </w:style>
+  <w:style w:type="table" w:styleId="Table10">
+    <w:basedOn w:val="TableNormal"/>
+    <w:rPr>
+      <w:sz w:val="22"/>
+      <w:szCs w:val="22"/>
+    </w:rPr>
+    <w:tblPr>
+      <w:tblStyleRowBandSize w:val="1"/>
+      <w:tblStyleColBandSize w:val="1"/>
+      <w:tblCellMar>
+        <w:top w:w="0.0" w:type="dxa"/>
+        <w:left w:w="108.0" w:type="dxa"/>
+        <w:bottom w:w="0.0" w:type="dxa"/>
+        <w:right w:w="108.0" w:type="dxa"/>
+      </w:tblCellMar>
+    </w:tblPr>
+  </w:style>
+  <w:style w:type="table" w:styleId="Table11">
+    <w:basedOn w:val="TableNormal"/>
+    <w:rPr>
+      <w:sz w:val="22"/>
+      <w:szCs w:val="22"/>
+    </w:rPr>
+    <w:tblPr>
+      <w:tblStyleRowBandSize w:val="1"/>
+      <w:tblStyleColBandSize w:val="1"/>
+      <w:tblCellMar>
+        <w:top w:w="0.0" w:type="dxa"/>
+        <w:left w:w="108.0" w:type="dxa"/>
+        <w:bottom w:w="0.0" w:type="dxa"/>
+        <w:right w:w="108.0" w:type="dxa"/>
+      </w:tblCellMar>
+    </w:tblPr>
+  </w:style>
+  <w:style w:type="table" w:styleId="Table12">
+    <w:basedOn w:val="TableNormal"/>
+    <w:rPr>
+      <w:sz w:val="22"/>
+      <w:szCs w:val="22"/>
+    </w:rPr>
+    <w:tblPr>
+      <w:tblStyleRowBandSize w:val="1"/>
+      <w:tblStyleColBandSize w:val="1"/>
+      <w:tblCellMar>
+        <w:top w:w="0.0" w:type="dxa"/>
+        <w:left w:w="108.0" w:type="dxa"/>
+        <w:bottom w:w="0.0" w:type="dxa"/>
+        <w:right w:w="108.0" w:type="dxa"/>
+      </w:tblCellMar>
+    </w:tblPr>
+  </w:style>
+  <w:style w:type="table" w:styleId="Table13">
+    <w:basedOn w:val="TableNormal"/>
+    <w:rPr>
+      <w:sz w:val="22"/>
+      <w:szCs w:val="22"/>
+    </w:rPr>
+    <w:tblPr>
+      <w:tblStyleRowBandSize w:val="1"/>
+      <w:tblStyleColBandSize w:val="1"/>
+      <w:tblCellMar>
+        <w:top w:w="0.0" w:type="dxa"/>
+        <w:left w:w="108.0" w:type="dxa"/>
+        <w:bottom w:w="0.0" w:type="dxa"/>
+        <w:right w:w="108.0" w:type="dxa"/>
+      </w:tblCellMar>
+    </w:tblPr>
+  </w:style>
+  <w:style w:type="table" w:styleId="Table14">
+    <w:basedOn w:val="TableNormal"/>
+    <w:rPr>
+      <w:sz w:val="22"/>
+      <w:szCs w:val="22"/>
+    </w:rPr>
+    <w:tblPr>
+      <w:tblStyleRowBandSize w:val="1"/>
+      <w:tblStyleColBandSize w:val="1"/>
+      <w:tblCellMar>
+        <w:top w:w="0.0" w:type="dxa"/>
+        <w:left w:w="108.0" w:type="dxa"/>
+        <w:bottom w:w="0.0" w:type="dxa"/>
+        <w:right w:w="108.0" w:type="dxa"/>
+      </w:tblCellMar>
+    </w:tblPr>
+  </w:style>
+  <w:style w:type="table" w:styleId="Table15">
+    <w:basedOn w:val="TableNormal"/>
+    <w:rPr>
+      <w:sz w:val="22"/>
+      <w:szCs w:val="22"/>
+    </w:rPr>
+    <w:tblPr>
+      <w:tblStyleRowBandSize w:val="1"/>
+      <w:tblStyleColBandSize w:val="1"/>
+      <w:tblCellMar>
+        <w:top w:w="0.0" w:type="dxa"/>
+        <w:left w:w="108.0" w:type="dxa"/>
+        <w:bottom w:w="0.0" w:type="dxa"/>
+        <w:right w:w="108.0" w:type="dxa"/>
+      </w:tblCellMar>
+    </w:tblPr>
+  </w:style>
+  <w:style w:type="table" w:styleId="Table16">
+    <w:basedOn w:val="TableNormal"/>
+    <w:rPr>
+      <w:sz w:val="22"/>
+      <w:szCs w:val="22"/>
+    </w:rPr>
+    <w:tblPr>
+      <w:tblStyleRowBandSize w:val="1"/>
+      <w:tblStyleColBandSize w:val="1"/>
+      <w:tblCellMar>
+        <w:top w:w="0.0" w:type="dxa"/>
+        <w:left w:w="108.0" w:type="dxa"/>
+        <w:bottom w:w="0.0" w:type="dxa"/>
+        <w:right w:w="108.0" w:type="dxa"/>
+      </w:tblCellMar>
+    </w:tblPr>
+  </w:style>
+  <w:style w:type="table" w:styleId="Table17">
+    <w:basedOn w:val="TableNormal"/>
+    <w:rPr>
+      <w:sz w:val="22"/>
+      <w:szCs w:val="22"/>
+    </w:rPr>
+    <w:tblPr>
+      <w:tblStyleRowBandSize w:val="1"/>
+      <w:tblStyleColBandSize w:val="1"/>
+      <w:tblCellMar>
+        <w:top w:w="0.0" w:type="dxa"/>
+        <w:left w:w="108.0" w:type="dxa"/>
+        <w:bottom w:w="0.0" w:type="dxa"/>
+        <w:right w:w="108.0" w:type="dxa"/>
+      </w:tblCellMar>
+    </w:tblPr>
+  </w:style>
+  <w:style w:type="table" w:styleId="Table18">
+    <w:basedOn w:val="TableNormal"/>
+    <w:rPr>
+      <w:sz w:val="22"/>
+      <w:szCs w:val="22"/>
+    </w:rPr>
+    <w:tblPr>
+      <w:tblStyleRowBandSize w:val="1"/>
+      <w:tblStyleColBandSize w:val="1"/>
+      <w:tblCellMar>
+        <w:top w:w="0.0" w:type="dxa"/>
+        <w:left w:w="108.0" w:type="dxa"/>
+        <w:bottom w:w="0.0" w:type="dxa"/>
+        <w:right w:w="108.0" w:type="dxa"/>
+      </w:tblCellMar>
+    </w:tblPr>
+  </w:style>
+  <w:style w:type="table" w:styleId="Table19">
+    <w:basedOn w:val="TableNormal"/>
+    <w:rPr>
+      <w:sz w:val="22"/>
+      <w:szCs w:val="22"/>
+    </w:rPr>
+    <w:tblPr>
+      <w:tblStyleRowBandSize w:val="1"/>
+      <w:tblStyleColBandSize w:val="1"/>
+      <w:tblCellMar>
+        <w:top w:w="0.0" w:type="dxa"/>
+        <w:left w:w="108.0" w:type="dxa"/>
+        <w:bottom w:w="0.0" w:type="dxa"/>
+        <w:right w:w="108.0" w:type="dxa"/>
+      </w:tblCellMar>
+    </w:tblPr>
   </w:style>
   <w:style w:type="table" w:styleId="Table1">
     <w:basedOn w:val="TableNormal"/>
@@ -10608,7 +10945,7 @@
 
 <file path=customXML/item1.xml><?xml version="1.0" encoding="utf-8"?>
 <go:gDocsCustomXmlDataStorage xmlns:go="http://customooxmlschemas.google.com/" xmlns:r="http://schemas.openxmlformats.org/officeDocument/2006/relationships" uri="GoogleDocsCustomDataVersion2">
-  <go:docsCustomData xmlns:go="http://customooxmlschemas.google.com/" roundtripDataSignature="AMtx7mh8yknJ0aeASP/cfz8j8qb87nh00g==">CgMxLjA4AHIhMWYtOFlRcEtxRE9vcnhvbE5aWm1yeGZmSXZ2dUM2QUxI</go:docsCustomData>
+  <go:docsCustomData xmlns:go="http://customooxmlschemas.google.com/" roundtripDataSignature="AMtx7miOk1DYaoIqHGtoEZsxr7JVjsLYqg==">CgMxLjA4AHIhMVBjcnhWeWxXOW5vZWNmVG1zaFl1bjZkTEJTV3dHTUhW</go:docsCustomData>
 </go:gDocsCustomXmlDataStorage>
 </file>
 

</xml_diff>